<commit_message>
Clarify course structure and refresh site design
- Add "course at a glance" section: theory exam from units 1-4, practical part by track (3 units each)
- Replace flat applied-units table with per-track unit cards; use the book's official course goals
- Merge duplicated grade tables into one grade-distribution card
- Use Cairo Arabic font, larger nav, scrollable nav on small screens
- Remove redundant home section, add track units to quick tracks, new FAQ entries
- Fix academic year and footer year; clarify the report cover download
- Remove unused attachments, README.txt, and dead CSS

Co-Authored-By: Claude Opus 5.5 <noreply@anthropic.com>
</commit_message>
<xml_diff>
--- a/files/report-sample.docx
+++ b/files/report-sample.docx
@@ -32,7 +32,7 @@
             <w:pPr>
               <w:jc w:val="center"/>
               <w:rPr>
-                <w:rFonts w:ascii="Sakkal Majalla" w:hAnsi="Sakkal Majalla" w:cs="Sakkal Majalla" w:hint="cs"/>
+                <w:rFonts w:ascii="Sakkal Majalla" w:hAnsi="Sakkal Majalla" w:cs="Sakkal Majalla"/>
                 <w:b/>
                 <w:bCs/>
                 <w:sz w:val="44"/>
@@ -74,7 +74,7 @@
             <w:pPr>
               <w:jc w:val="center"/>
               <w:rPr>
-                <w:rFonts w:ascii="Sakkal Majalla" w:hAnsi="Sakkal Majalla" w:cs="Sakkal Majalla" w:hint="cs"/>
+                <w:rFonts w:ascii="Sakkal Majalla" w:hAnsi="Sakkal Majalla" w:cs="Sakkal Majalla"/>
                 <w:b/>
                 <w:bCs/>
                 <w:sz w:val="44"/>
@@ -91,7 +91,7 @@
           <w:p>
             <w:pPr>
               <w:rPr>
-                <w:rFonts w:ascii="Sakkal Majalla" w:hAnsi="Sakkal Majalla" w:cs="Sakkal Majalla" w:hint="cs"/>
+                <w:rFonts w:ascii="Sakkal Majalla" w:hAnsi="Sakkal Majalla" w:cs="Sakkal Majalla"/>
                 <w:b/>
                 <w:bCs/>
                 <w:sz w:val="44"/>
@@ -187,7 +187,7 @@
             <w:pPr>
               <w:jc w:val="center"/>
               <w:rPr>
-                <w:rFonts w:ascii="Sakkal Majalla" w:hAnsi="Sakkal Majalla" w:cs="Sakkal Majalla" w:hint="cs"/>
+                <w:rFonts w:ascii="Sakkal Majalla" w:hAnsi="Sakkal Majalla" w:cs="Sakkal Majalla"/>
                 <w:b/>
                 <w:bCs/>
                 <w:sz w:val="44"/>
@@ -232,7 +232,7 @@
             <w:pPr>
               <w:jc w:val="center"/>
               <w:rPr>
-                <w:rFonts w:ascii="Sakkal Majalla" w:hAnsi="Sakkal Majalla" w:cs="Sakkal Majalla" w:hint="cs"/>
+                <w:rFonts w:ascii="Sakkal Majalla" w:hAnsi="Sakkal Majalla" w:cs="Sakkal Majalla"/>
                 <w:b/>
                 <w:bCs/>
                 <w:sz w:val="44"/>
@@ -264,7 +264,7 @@
             <w:pPr>
               <w:jc w:val="center"/>
               <w:rPr>
-                <w:rFonts w:ascii="Sakkal Majalla" w:hAnsi="Sakkal Majalla" w:cs="Sakkal Majalla" w:hint="cs"/>
+                <w:rFonts w:ascii="Sakkal Majalla" w:hAnsi="Sakkal Majalla" w:cs="Sakkal Majalla"/>
                 <w:b/>
                 <w:bCs/>
                 <w:sz w:val="44"/>
@@ -296,7 +296,7 @@
             <w:pPr>
               <w:jc w:val="center"/>
               <w:rPr>
-                <w:rFonts w:ascii="Sakkal Majalla" w:hAnsi="Sakkal Majalla" w:cs="Sakkal Majalla" w:hint="cs"/>
+                <w:rFonts w:ascii="Sakkal Majalla" w:hAnsi="Sakkal Majalla" w:cs="Sakkal Majalla"/>
                 <w:b/>
                 <w:bCs/>
                 <w:sz w:val="44"/>
@@ -328,7 +328,7 @@
             <w:pPr>
               <w:jc w:val="center"/>
               <w:rPr>
-                <w:rFonts w:ascii="Sakkal Majalla" w:hAnsi="Sakkal Majalla" w:cs="Sakkal Majalla" w:hint="cs"/>
+                <w:rFonts w:ascii="Sakkal Majalla" w:hAnsi="Sakkal Majalla" w:cs="Sakkal Majalla"/>
                 <w:b/>
                 <w:bCs/>
                 <w:sz w:val="44"/>
@@ -354,7 +354,27 @@
                 <w:sz w:val="44"/>
                 <w:szCs w:val="44"/>
               </w:rPr>
-              <w:t>1251</w:t>
+              <w:t>12</w:t>
+            </w:r>
+            <w:r>
+              <w:rPr>
+                <w:rFonts w:ascii="Sakkal Majalla" w:hAnsi="Sakkal Majalla" w:cs="Sakkal Majalla"/>
+                <w:b/>
+                <w:bCs/>
+                <w:sz w:val="44"/>
+                <w:szCs w:val="44"/>
+              </w:rPr>
+              <w:t>6</w:t>
+            </w:r>
+            <w:r>
+              <w:rPr>
+                <w:rFonts w:ascii="Sakkal Majalla" w:hAnsi="Sakkal Majalla" w:cs="Sakkal Majalla"/>
+                <w:b/>
+                <w:bCs/>
+                <w:sz w:val="44"/>
+                <w:szCs w:val="44"/>
+              </w:rPr>
+              <w:t>1</w:t>
             </w:r>
           </w:p>
         </w:tc>
@@ -377,7 +397,7 @@
       <w:pPr>
         <w:jc w:val="center"/>
         <w:rPr>
-          <w:rFonts w:ascii="Sakkal Majalla" w:hAnsi="Sakkal Majalla" w:cs="Sakkal Majalla" w:hint="cs"/>
+          <w:rFonts w:ascii="Sakkal Majalla" w:hAnsi="Sakkal Majalla" w:cs="Sakkal Majalla"/>
           <w:b/>
           <w:bCs/>
           <w:sz w:val="44"/>
@@ -548,21 +568,21 @@
         <w:tblLook w:val="04A0" w:firstRow="1" w:lastRow="0" w:firstColumn="1" w:lastColumn="0" w:noHBand="0" w:noVBand="1"/>
       </w:tblPr>
       <w:tblGrid>
-        <w:gridCol w:w="577"/>
+        <w:gridCol w:w="578"/>
         <w:gridCol w:w="3401"/>
         <w:gridCol w:w="2792"/>
-        <w:gridCol w:w="1526"/>
+        <w:gridCol w:w="1525"/>
       </w:tblGrid>
       <w:tr>
         <w:tc>
           <w:tcPr>
-            <w:tcW w:w="347" w:type="pct"/>
+            <w:tcW w:w="348" w:type="pct"/>
             <w:shd w:val="clear" w:color="auto" w:fill="DEEAF6" w:themeFill="accent5" w:themeFillTint="33"/>
           </w:tcPr>
           <w:p>
             <w:pPr>
               <w:rPr>
-                <w:rFonts w:ascii="Sakkal Majalla" w:hAnsi="Sakkal Majalla" w:cs="Sakkal Majalla" w:hint="cs"/>
+                <w:rFonts w:ascii="Sakkal Majalla" w:hAnsi="Sakkal Majalla" w:cs="Sakkal Majalla"/>
                 <w:b/>
                 <w:bCs/>
                 <w:sz w:val="32"/>
@@ -652,7 +672,7 @@
             <w:pPr>
               <w:jc w:val="center"/>
               <w:rPr>
-                <w:rFonts w:ascii="Sakkal Majalla" w:hAnsi="Sakkal Majalla" w:cs="Sakkal Majalla" w:hint="cs"/>
+                <w:rFonts w:ascii="Sakkal Majalla" w:hAnsi="Sakkal Majalla" w:cs="Sakkal Majalla"/>
                 <w:b/>
                 <w:bCs/>
                 <w:sz w:val="32"/>
@@ -677,7 +697,7 @@
       <w:tr>
         <w:tc>
           <w:tcPr>
-            <w:tcW w:w="347" w:type="pct"/>
+            <w:tcW w:w="348" w:type="pct"/>
           </w:tcPr>
           <w:p>
             <w:pPr>
@@ -759,177 +779,19 @@
           </w:p>
         </w:tc>
       </w:tr>
-      <w:tr>
-        <w:tc>
-          <w:tcPr>
-            <w:tcW w:w="347" w:type="pct"/>
-          </w:tcPr>
-          <w:p>
-            <w:pPr>
-              <w:jc w:val="center"/>
-              <w:rPr>
-                <w:rFonts w:ascii="Sakkal Majalla" w:hAnsi="Sakkal Majalla" w:cs="Sakkal Majalla"/>
-                <w:b/>
-                <w:bCs/>
-                <w:sz w:val="32"/>
-                <w:szCs w:val="32"/>
-                <w:rtl/>
-              </w:rPr>
-            </w:pPr>
-            <w:r>
-              <w:rPr>
-                <w:rFonts w:ascii="Sakkal Majalla" w:hAnsi="Sakkal Majalla" w:cs="Sakkal Majalla" w:hint="cs"/>
-                <w:b/>
-                <w:bCs/>
-                <w:sz w:val="32"/>
-                <w:szCs w:val="32"/>
-                <w:rtl/>
-              </w:rPr>
-              <w:t>2</w:t>
-            </w:r>
-          </w:p>
-        </w:tc>
-        <w:tc>
-          <w:tcPr>
-            <w:tcW w:w="2050" w:type="pct"/>
-          </w:tcPr>
-          <w:p>
-            <w:pPr>
-              <w:jc w:val="center"/>
-              <w:rPr>
-                <w:rFonts w:ascii="Sakkal Majalla" w:hAnsi="Sakkal Majalla" w:cs="Sakkal Majalla"/>
-                <w:b/>
-                <w:bCs/>
-                <w:sz w:val="32"/>
-                <w:szCs w:val="32"/>
-                <w:rtl/>
-              </w:rPr>
-            </w:pPr>
-          </w:p>
-        </w:tc>
-        <w:tc>
-          <w:tcPr>
-            <w:tcW w:w="1683" w:type="pct"/>
-          </w:tcPr>
-          <w:p>
-            <w:pPr>
-              <w:jc w:val="center"/>
-              <w:rPr>
-                <w:rFonts w:ascii="Sakkal Majalla" w:hAnsi="Sakkal Majalla" w:cs="Sakkal Majalla"/>
-                <w:b/>
-                <w:bCs/>
-                <w:sz w:val="32"/>
-                <w:szCs w:val="32"/>
-                <w:rtl/>
-              </w:rPr>
-            </w:pPr>
-          </w:p>
-        </w:tc>
-        <w:tc>
-          <w:tcPr>
-            <w:tcW w:w="920" w:type="pct"/>
-          </w:tcPr>
-          <w:p>
-            <w:pPr>
-              <w:jc w:val="center"/>
-              <w:rPr>
-                <w:rFonts w:ascii="Sakkal Majalla" w:hAnsi="Sakkal Majalla" w:cs="Sakkal Majalla"/>
-                <w:b/>
-                <w:bCs/>
-                <w:sz w:val="32"/>
-                <w:szCs w:val="32"/>
-                <w:rtl/>
-              </w:rPr>
-            </w:pPr>
-          </w:p>
-        </w:tc>
-      </w:tr>
-      <w:tr>
-        <w:tc>
-          <w:tcPr>
-            <w:tcW w:w="347" w:type="pct"/>
-          </w:tcPr>
-          <w:p>
-            <w:pPr>
-              <w:jc w:val="center"/>
-              <w:rPr>
-                <w:rFonts w:ascii="Sakkal Majalla" w:hAnsi="Sakkal Majalla" w:cs="Sakkal Majalla"/>
-                <w:b/>
-                <w:bCs/>
-                <w:sz w:val="32"/>
-                <w:szCs w:val="32"/>
-                <w:rtl/>
-              </w:rPr>
-            </w:pPr>
-            <w:r>
-              <w:rPr>
-                <w:rFonts w:ascii="Sakkal Majalla" w:hAnsi="Sakkal Majalla" w:cs="Sakkal Majalla" w:hint="cs"/>
-                <w:b/>
-                <w:bCs/>
-                <w:sz w:val="32"/>
-                <w:szCs w:val="32"/>
-                <w:rtl/>
-              </w:rPr>
-              <w:t>3</w:t>
-            </w:r>
-          </w:p>
-        </w:tc>
-        <w:tc>
-          <w:tcPr>
-            <w:tcW w:w="2050" w:type="pct"/>
-          </w:tcPr>
-          <w:p>
-            <w:pPr>
-              <w:jc w:val="center"/>
-              <w:rPr>
-                <w:rFonts w:ascii="Sakkal Majalla" w:hAnsi="Sakkal Majalla" w:cs="Sakkal Majalla"/>
-                <w:b/>
-                <w:bCs/>
-                <w:sz w:val="32"/>
-                <w:szCs w:val="32"/>
-                <w:rtl/>
-              </w:rPr>
-            </w:pPr>
-          </w:p>
-        </w:tc>
-        <w:tc>
-          <w:tcPr>
-            <w:tcW w:w="1683" w:type="pct"/>
-          </w:tcPr>
-          <w:p>
-            <w:pPr>
-              <w:jc w:val="center"/>
-              <w:rPr>
-                <w:rFonts w:ascii="Sakkal Majalla" w:hAnsi="Sakkal Majalla" w:cs="Sakkal Majalla"/>
-                <w:b/>
-                <w:bCs/>
-                <w:sz w:val="32"/>
-                <w:szCs w:val="32"/>
-                <w:rtl/>
-              </w:rPr>
-            </w:pPr>
-          </w:p>
-        </w:tc>
-        <w:tc>
-          <w:tcPr>
-            <w:tcW w:w="920" w:type="pct"/>
-          </w:tcPr>
-          <w:p>
-            <w:pPr>
-              <w:jc w:val="center"/>
-              <w:rPr>
-                <w:rFonts w:ascii="Sakkal Majalla" w:hAnsi="Sakkal Majalla" w:cs="Sakkal Majalla"/>
-                <w:b/>
-                <w:bCs/>
-                <w:sz w:val="32"/>
-                <w:szCs w:val="32"/>
-                <w:rtl/>
-              </w:rPr>
-            </w:pPr>
-          </w:p>
-        </w:tc>
-      </w:tr>
     </w:tbl>
+    <w:p>
+      <w:pPr>
+        <w:jc w:val="center"/>
+        <w:rPr>
+          <w:rFonts w:ascii="Sakkal Majalla" w:hAnsi="Sakkal Majalla" w:cs="Sakkal Majalla"/>
+          <w:b/>
+          <w:bCs/>
+          <w:sz w:val="44"/>
+          <w:szCs w:val="44"/>
+        </w:rPr>
+      </w:pPr>
+    </w:p>
     <w:p>
       <w:pPr>
         <w:jc w:val="center"/>
@@ -976,7 +838,6 @@
           <w:bCs/>
           <w:sz w:val="44"/>
           <w:szCs w:val="44"/>
-          <w:rtl/>
         </w:rPr>
       </w:pPr>
       <w:r>
@@ -1023,6 +884,19 @@
         </w:rPr>
         <w:t xml:space="preserve"> النتشة</w:t>
       </w:r>
+    </w:p>
+    <w:p>
+      <w:pPr>
+        <w:jc w:val="center"/>
+        <w:rPr>
+          <w:rFonts w:ascii="Sakkal Majalla" w:hAnsi="Sakkal Majalla" w:cs="Sakkal Majalla"/>
+          <w:b/>
+          <w:bCs/>
+          <w:sz w:val="44"/>
+          <w:szCs w:val="44"/>
+          <w:rtl/>
+        </w:rPr>
+      </w:pPr>
     </w:p>
     <w:sectPr>
       <w:pgSz w:w="11906" w:h="16838"/>

</xml_diff>